<commit_message>
Update main checklist guide for new functions
</commit_message>
<xml_diff>
--- a/guides/Main_Checklist_Generator_How_To_Guide.docx
+++ b/guides/Main_Checklist_Generator_How_To_Guide.docx
@@ -1249,6 +1249,480 @@
         <w:t>If export output looks outdated, reopen the plan, save it again, and rerun the export so current task state is included.</w:t>
       </w:r>
     </w:p>
+    <w:p>
+      <w:r>
+        <w:br w:type="page"/>
+      </w:r>
+    </w:p>
+    <w:p>
+      <w:pPr>
+        <w:pStyle w:val="Heading1"/>
+      </w:pPr>
+      <w:r>
+        <w:rPr>
+          <w:color w:val="1F4E79"/>
+        </w:rPr>
+        <w:t>March 2026 Feature Update</w:t>
+      </w:r>
+    </w:p>
+    <w:p>
+      <w:pPr>
+        <w:jc w:val="left"/>
+      </w:pPr>
+      <w:r>
+        <w:rPr>
+          <w:color w:val="163040"/>
+          <w:sz w:val="21"/>
+        </w:rPr>
+        <w:t>The Main Checklist Generator now includes several workflow helpers that make live plan execution less scattered and easier to manage during active implementation work.</w:t>
+      </w:r>
+    </w:p>
+    <w:p>
+      <w:pPr>
+        <w:pStyle w:val="ListBullet"/>
+      </w:pPr>
+      <w:r>
+        <w:rPr>
+          <w:color w:val="163040"/>
+          <w:sz w:val="21"/>
+        </w:rPr>
+        <w:t>Pinned task notes let users promote important task-level notes into a dedicated pinboard so reminders do not get buried inside a single phase.</w:t>
+      </w:r>
+    </w:p>
+    <w:p>
+      <w:pPr>
+        <w:pStyle w:val="ListBullet"/>
+      </w:pPr>
+      <w:r>
+        <w:rPr>
+          <w:color w:val="163040"/>
+          <w:sz w:val="21"/>
+        </w:rPr>
+        <w:t>Freeform pins make it possible to store quick working notes that are not tied to a single checklist task.</w:t>
+      </w:r>
+    </w:p>
+    <w:p>
+      <w:pPr>
+        <w:pStyle w:val="ListBullet"/>
+      </w:pPr>
+      <w:r>
+        <w:rPr>
+          <w:color w:val="163040"/>
+          <w:sz w:val="21"/>
+        </w:rPr>
+        <w:t>Pinned notes can be reordered directly in the pinboard, which is useful for triaging the most urgent follow-up items.</w:t>
+      </w:r>
+    </w:p>
+    <w:p>
+      <w:pPr>
+        <w:pStyle w:val="ListBullet"/>
+      </w:pPr>
+      <w:r>
+        <w:rPr>
+          <w:color w:val="163040"/>
+          <w:sz w:val="21"/>
+        </w:rPr>
+        <w:t>Custom calendar items let users add their own milestones and reminders alongside generated checklist due dates.</w:t>
+      </w:r>
+    </w:p>
+    <w:p>
+      <w:pPr>
+        <w:pStyle w:val="ListBullet"/>
+      </w:pPr>
+      <w:r>
+        <w:rPr>
+          <w:color w:val="163040"/>
+          <w:sz w:val="21"/>
+        </w:rPr>
+        <w:t>Custom calendar dates surface in both the mini calendar and the full calendar view, so user-added events stay visible throughout the app.</w:t>
+      </w:r>
+    </w:p>
+    <w:p>
+      <w:pPr>
+        <w:pStyle w:val="ListBullet"/>
+      </w:pPr>
+      <w:r>
+        <w:rPr>
+          <w:color w:val="163040"/>
+          <w:sz w:val="21"/>
+        </w:rPr>
+        <w:t>The intake team directory was refreshed so TM and TC dropdowns use the newer contact list and email autofill values.</w:t>
+      </w:r>
+    </w:p>
+    <w:p>
+      <w:pPr>
+        <w:pStyle w:val="Heading2"/>
+      </w:pPr>
+      <w:r>
+        <w:rPr>
+          <w:color w:val="1F4E79"/>
+        </w:rPr>
+        <w:t>New Function Reference</w:t>
+      </w:r>
+    </w:p>
+    <w:tbl>
+      <w:tblPr>
+        <w:tblStyle w:val="TableGrid"/>
+        <w:tblW w:type="auto" w:w="0"/>
+        <w:tblLook w:firstColumn="1" w:firstRow="1" w:lastColumn="0" w:lastRow="0" w:noHBand="0" w:noVBand="1" w:val="04A0"/>
+      </w:tblPr>
+      <w:tblGrid>
+        <w:gridCol w:w="3360"/>
+        <w:gridCol w:w="3360"/>
+        <w:gridCol w:w="3360"/>
+      </w:tblGrid>
+      <w:tr>
+        <w:tc>
+          <w:tcPr>
+            <w:tcW w:type="dxa" w:w="3360"/>
+            <w:shd w:fill="D9EAF7"/>
+          </w:tcPr>
+          <w:p>
+            <w:r>
+              <w:rPr>
+                <w:b/>
+                <w:color w:val="163040"/>
+                <w:sz w:val="20"/>
+              </w:rPr>
+              <w:t>Function</w:t>
+            </w:r>
+          </w:p>
+        </w:tc>
+        <w:tc>
+          <w:tcPr>
+            <w:tcW w:type="dxa" w:w="3360"/>
+            <w:shd w:fill="D9EAF7"/>
+          </w:tcPr>
+          <w:p>
+            <w:r>
+              <w:rPr>
+                <w:b/>
+                <w:color w:val="163040"/>
+                <w:sz w:val="20"/>
+              </w:rPr>
+              <w:t>Where It Lives</w:t>
+            </w:r>
+          </w:p>
+        </w:tc>
+        <w:tc>
+          <w:tcPr>
+            <w:tcW w:type="dxa" w:w="3360"/>
+            <w:shd w:fill="D9EAF7"/>
+          </w:tcPr>
+          <w:p>
+            <w:r>
+              <w:rPr>
+                <w:b/>
+                <w:color w:val="163040"/>
+                <w:sz w:val="20"/>
+              </w:rPr>
+              <w:t>Why It Matters</w:t>
+            </w:r>
+          </w:p>
+        </w:tc>
+      </w:tr>
+      <w:tr>
+        <w:tc>
+          <w:tcPr>
+            <w:tcW w:type="dxa" w:w="3360"/>
+          </w:tcPr>
+          <w:p>
+            <w:r>
+              <w:rPr>
+                <w:color w:val="163040"/>
+                <w:sz w:val="20"/>
+              </w:rPr>
+              <w:t>Task Note Pinning</w:t>
+            </w:r>
+          </w:p>
+        </w:tc>
+        <w:tc>
+          <w:tcPr>
+            <w:tcW w:type="dxa" w:w="3360"/>
+          </w:tcPr>
+          <w:p>
+            <w:r>
+              <w:rPr>
+                <w:color w:val="163040"/>
+                <w:sz w:val="20"/>
+              </w:rPr>
+              <w:t>Checklist task note area</w:t>
+            </w:r>
+          </w:p>
+        </w:tc>
+        <w:tc>
+          <w:tcPr>
+            <w:tcW w:type="dxa" w:w="3360"/>
+          </w:tcPr>
+          <w:p>
+            <w:r>
+              <w:rPr>
+                <w:color w:val="163040"/>
+                <w:sz w:val="20"/>
+              </w:rPr>
+              <w:t>Turns a task note into a reusable pin so it remains visible while the rest of the checklist moves forward.</w:t>
+            </w:r>
+          </w:p>
+        </w:tc>
+      </w:tr>
+      <w:tr>
+        <w:tc>
+          <w:tcPr>
+            <w:tcW w:type="dxa" w:w="3360"/>
+          </w:tcPr>
+          <w:p>
+            <w:r>
+              <w:rPr>
+                <w:color w:val="163040"/>
+                <w:sz w:val="20"/>
+              </w:rPr>
+              <w:t>Pinboard</w:t>
+            </w:r>
+          </w:p>
+        </w:tc>
+        <w:tc>
+          <w:tcPr>
+            <w:tcW w:type="dxa" w:w="3360"/>
+          </w:tcPr>
+          <w:p>
+            <w:r>
+              <w:rPr>
+                <w:color w:val="163040"/>
+                <w:sz w:val="20"/>
+              </w:rPr>
+              <w:t>Checklist workspace center rail</w:t>
+            </w:r>
+          </w:p>
+        </w:tc>
+        <w:tc>
+          <w:tcPr>
+            <w:tcW w:type="dxa" w:w="3360"/>
+          </w:tcPr>
+          <w:p>
+            <w:r>
+              <w:rPr>
+                <w:color w:val="163040"/>
+                <w:sz w:val="20"/>
+              </w:rPr>
+              <w:t>Keeps important reminders, blockers, and ad hoc working notes in one dedicated place.</w:t>
+            </w:r>
+          </w:p>
+        </w:tc>
+      </w:tr>
+      <w:tr>
+        <w:tc>
+          <w:tcPr>
+            <w:tcW w:type="dxa" w:w="3360"/>
+          </w:tcPr>
+          <w:p>
+            <w:r>
+              <w:rPr>
+                <w:color w:val="163040"/>
+                <w:sz w:val="20"/>
+              </w:rPr>
+              <w:t>Freeform Pins</w:t>
+            </w:r>
+          </w:p>
+        </w:tc>
+        <w:tc>
+          <w:tcPr>
+            <w:tcW w:type="dxa" w:w="3360"/>
+          </w:tcPr>
+          <w:p>
+            <w:r>
+              <w:rPr>
+                <w:color w:val="163040"/>
+                <w:sz w:val="20"/>
+              </w:rPr>
+              <w:t>Pinboard add form</w:t>
+            </w:r>
+          </w:p>
+        </w:tc>
+        <w:tc>
+          <w:tcPr>
+            <w:tcW w:type="dxa" w:w="3360"/>
+          </w:tcPr>
+          <w:p>
+            <w:r>
+              <w:rPr>
+                <w:color w:val="163040"/>
+                <w:sz w:val="20"/>
+              </w:rPr>
+              <w:t>Lets users track reminders that are not tied to any one checklist task.</w:t>
+            </w:r>
+          </w:p>
+        </w:tc>
+      </w:tr>
+      <w:tr>
+        <w:tc>
+          <w:tcPr>
+            <w:tcW w:type="dxa" w:w="3360"/>
+          </w:tcPr>
+          <w:p>
+            <w:r>
+              <w:rPr>
+                <w:color w:val="163040"/>
+                <w:sz w:val="20"/>
+              </w:rPr>
+              <w:t>Custom Calendar Items</w:t>
+            </w:r>
+          </w:p>
+        </w:tc>
+        <w:tc>
+          <w:tcPr>
+            <w:tcW w:type="dxa" w:w="3360"/>
+          </w:tcPr>
+          <w:p>
+            <w:r>
+              <w:rPr>
+                <w:color w:val="163040"/>
+                <w:sz w:val="20"/>
+              </w:rPr>
+              <w:t>Mini calendar and full calendar</w:t>
+            </w:r>
+          </w:p>
+        </w:tc>
+        <w:tc>
+          <w:tcPr>
+            <w:tcW w:type="dxa" w:w="3360"/>
+          </w:tcPr>
+          <w:p>
+            <w:r>
+              <w:rPr>
+                <w:color w:val="163040"/>
+                <w:sz w:val="20"/>
+              </w:rPr>
+              <w:t>Adds manual milestones such as meetings, client checkpoints, and internal deadlines alongside generated plan dates.</w:t>
+            </w:r>
+          </w:p>
+        </w:tc>
+      </w:tr>
+      <w:tr>
+        <w:tc>
+          <w:tcPr>
+            <w:tcW w:type="dxa" w:w="3360"/>
+          </w:tcPr>
+          <w:p>
+            <w:r>
+              <w:rPr>
+                <w:color w:val="163040"/>
+                <w:sz w:val="20"/>
+              </w:rPr>
+              <w:t>Updated TM/TC Directory</w:t>
+            </w:r>
+          </w:p>
+        </w:tc>
+        <w:tc>
+          <w:tcPr>
+            <w:tcW w:type="dxa" w:w="3360"/>
+          </w:tcPr>
+          <w:p>
+            <w:r>
+              <w:rPr>
+                <w:color w:val="163040"/>
+                <w:sz w:val="20"/>
+              </w:rPr>
+              <w:t>Intake screen team section</w:t>
+            </w:r>
+          </w:p>
+        </w:tc>
+        <w:tc>
+          <w:tcPr>
+            <w:tcW w:type="dxa" w:w="3360"/>
+          </w:tcPr>
+          <w:p>
+            <w:r>
+              <w:rPr>
+                <w:color w:val="163040"/>
+                <w:sz w:val="20"/>
+              </w:rPr>
+              <w:t>Improves contact autofill accuracy when starting a new implementation plan.</w:t>
+            </w:r>
+          </w:p>
+        </w:tc>
+      </w:tr>
+    </w:tbl>
+    <w:p>
+      <w:pPr>
+        <w:pStyle w:val="Heading2"/>
+      </w:pPr>
+      <w:r>
+        <w:rPr>
+          <w:color w:val="1F4E79"/>
+        </w:rPr>
+        <w:t>Recommended Usage Pattern</w:t>
+      </w:r>
+    </w:p>
+    <w:p>
+      <w:pPr>
+        <w:pStyle w:val="ListNumber"/>
+      </w:pPr>
+      <w:r>
+        <w:rPr>
+          <w:color w:val="163040"/>
+          <w:sz w:val="21"/>
+        </w:rPr>
+        <w:t>Generate or load the plan as usual from the intake screen.</w:t>
+      </w:r>
+    </w:p>
+    <w:p>
+      <w:pPr>
+        <w:pStyle w:val="ListNumber"/>
+      </w:pPr>
+      <w:r>
+        <w:rPr>
+          <w:color w:val="163040"/>
+          <w:sz w:val="21"/>
+        </w:rPr>
+        <w:t>Use task notes for detail that belongs to a specific task, then pin only the items that need constant visibility.</w:t>
+      </w:r>
+    </w:p>
+    <w:p>
+      <w:pPr>
+        <w:pStyle w:val="ListNumber"/>
+      </w:pPr>
+      <w:r>
+        <w:rPr>
+          <w:color w:val="163040"/>
+          <w:sz w:val="21"/>
+        </w:rPr>
+        <w:t>Create freeform pins for cross-phase reminders such as client follow-up, payroll confirmations, or internal escalation notes.</w:t>
+      </w:r>
+    </w:p>
+    <w:p>
+      <w:pPr>
+        <w:pStyle w:val="ListNumber"/>
+      </w:pPr>
+      <w:r>
+        <w:rPr>
+          <w:color w:val="163040"/>
+          <w:sz w:val="21"/>
+        </w:rPr>
+        <w:t>Add custom calendar items for non-generated milestones like meetings, deadlines, or manual checkpoints.</w:t>
+      </w:r>
+    </w:p>
+    <w:p>
+      <w:pPr>
+        <w:pStyle w:val="ListNumber"/>
+      </w:pPr>
+      <w:r>
+        <w:rPr>
+          <w:color w:val="163040"/>
+          <w:sz w:val="21"/>
+        </w:rPr>
+        <w:t>Use the dashboard, vault, and calendar views as rollups, but keep the pinboard as the day-to-day execution scratchpad.</w:t>
+      </w:r>
+    </w:p>
+    <w:p>
+      <w:r>
+        <w:rPr>
+          <w:i/>
+          <w:color w:val="1F4E79"/>
+          <w:sz w:val="19"/>
+        </w:rPr>
+        <w:t>Feature update appended March 19, 2026.</w:t>
+      </w:r>
+    </w:p>
     <w:sectPr>
       <w:pgSz w:w="12240" w:h="15840"/>
       <w:pgMar w:top="1008" w:right="1080" w:bottom="1008" w:left="1080" w:header="720" w:footer="720" w:gutter="0"/>

</xml_diff>